<commit_message>
Felulet ujratervezese: profi, mernoki eszkoz-jellegu UI (Carbon-elvek)
</commit_message>
<xml_diff>
--- a/Dokumentáció_2026.docx
+++ b/Dokumentáció_2026.docx
@@ -1880,15 +1880,44 @@
       </w:r>
     </w:p>
     <w:p>
-      <w:pPr>
-        <w:pStyle w:val="ListBullet"/>
-      </w:pPr>
       <w:r>
         <w:rPr>
           <w:b w:val="0"/>
           <w:i w:val="0"/>
         </w:rPr>
-        <w:t>Sötét és világos téma (a választás a böngészőben megjegyződik).</w:t>
+        <w:t xml:space="preserve">A felület tudatosan </w:t>
+      </w:r>
+      <w:r>
+        <w:rPr>
+          <w:b/>
+          <w:i w:val="0"/>
+        </w:rPr>
+        <w:t>mérnöki eszköz</w:t>
+      </w:r>
+      <w:r>
+        <w:rPr>
+          <w:b w:val="0"/>
+          <w:i w:val="0"/>
+        </w:rPr>
+        <w:t>, nem bemutatóoldal: a vezérlők négy fülön</w:t>
+      </w:r>
+    </w:p>
+    <w:p>
+      <w:r>
+        <w:rPr>
+          <w:b w:val="0"/>
+          <w:i w:val="0"/>
+        </w:rPr>
+        <w:t>(Kezdőállapot / Kapuk / Mentés / Bemutatók) érhetők el, a Bloch-gömb és az élő adatok</w:t>
+      </w:r>
+    </w:p>
+    <w:p>
+      <w:r>
+        <w:rPr>
+          <w:b w:val="0"/>
+          <w:i w:val="0"/>
+        </w:rPr>
+        <w:t>pedig folyamatosan láthatók a jobb oldalon.</w:t>
       </w:r>
     </w:p>
     <w:p>
@@ -1897,10 +1926,44 @@
       </w:pPr>
       <w:r>
         <w:rPr>
+          <w:b/>
+          <w:i w:val="0"/>
+        </w:rPr>
+        <w:t>Egy akcentszín + neutrális szürkeskála</w:t>
+      </w:r>
+      <w:r>
+        <w:rPr>
           <w:b w:val="0"/>
           <w:i w:val="0"/>
         </w:rPr>
-        <w:t>Reszponzív elrendezés: asztali gépen két hasáb, mobilon egy hasáb.</w:t>
+        <w:t>, keret-alapú rétegzés árnyékok helyett,</w:t>
+      </w:r>
+    </w:p>
+    <w:p>
+      <w:r>
+        <w:rPr>
+          <w:b w:val="0"/>
+          <w:i w:val="0"/>
+        </w:rPr>
+        <w:t>4/8/12/16 px-es térköz-skála, 12–14 px-es produktív tipográfia, sematikus</w:t>
+      </w:r>
+    </w:p>
+    <w:p>
+      <w:r>
+        <w:rPr>
+          <w:b w:val="0"/>
+          <w:i w:val="0"/>
+        </w:rPr>
+        <w:t>vonalikonok – nincs emoji, nincs színátmenet. (Az elvek az IBM Carbon design</w:t>
+      </w:r>
+    </w:p>
+    <w:p>
+      <w:r>
+        <w:rPr>
+          <w:b w:val="0"/>
+          <w:i w:val="0"/>
+        </w:rPr>
+        <w:t>rendszer nyilvános irányelveit követik.)</w:t>
       </w:r>
     </w:p>
     <w:p>
@@ -1909,10 +1972,90 @@
       </w:pPr>
       <w:r>
         <w:rPr>
+          <w:b/>
+          <w:i w:val="0"/>
+        </w:rPr>
+        <w:t>Sötét és világos téma</w:t>
+      </w:r>
+      <w:r>
+        <w:rPr>
           <w:b w:val="0"/>
           <w:i w:val="0"/>
         </w:rPr>
-        <w:t xml:space="preserve">Billentyűparancsok: </w:t>
+        <w:t xml:space="preserve"> (a választás a böngészőben megjegyződik).</w:t>
+      </w:r>
+    </w:p>
+    <w:p>
+      <w:pPr>
+        <w:pStyle w:val="ListBullet"/>
+      </w:pPr>
+      <w:r>
+        <w:rPr>
+          <w:b/>
+          <w:i w:val="0"/>
+        </w:rPr>
+        <w:t>Reszponzív elrendezés</w:t>
+      </w:r>
+      <w:r>
+        <w:rPr>
+          <w:b w:val="0"/>
+          <w:i w:val="0"/>
+        </w:rPr>
+        <w:t>: asztali gépen két hasáb, mobilon egy hasáb (a gömb felül).</w:t>
+      </w:r>
+    </w:p>
+    <w:p>
+      <w:pPr>
+        <w:pStyle w:val="ListBullet"/>
+      </w:pPr>
+      <w:r>
+        <w:rPr>
+          <w:b w:val="0"/>
+          <w:i w:val="0"/>
+        </w:rPr>
+        <w:t xml:space="preserve">A gömb alatt mindig látszik az </w:t>
+      </w:r>
+      <w:r>
+        <w:rPr>
+          <w:b/>
+          <w:i w:val="0"/>
+        </w:rPr>
+        <w:t>állapotvektor</w:t>
+      </w:r>
+      <w:r>
+        <w:rPr>
+          <w:b w:val="0"/>
+          <w:i w:val="0"/>
+        </w:rPr>
+        <w:t xml:space="preserve"> matematikai alakja, a θ/φ szögek,</w:t>
+      </w:r>
+    </w:p>
+    <w:p>
+      <w:r>
+        <w:rPr>
+          <w:b w:val="0"/>
+          <w:i w:val="0"/>
+        </w:rPr>
+        <w:t>az x, y, z koordináták, a norma és a két mérési valószínűség.</w:t>
+      </w:r>
+    </w:p>
+    <w:p>
+      <w:pPr>
+        <w:pStyle w:val="ListBullet"/>
+      </w:pPr>
+      <w:r>
+        <w:rPr>
+          <w:b/>
+          <w:i w:val="0"/>
+        </w:rPr>
+        <w:t>Billentyűparancsok</w:t>
+      </w:r>
+      <w:r>
+        <w:rPr>
+          <w:b w:val="0"/>
+          <w:i w:val="0"/>
+        </w:rPr>
+        <w:t xml:space="preserve">: </w:t>
       </w:r>
       <w:r>
         <w:rPr>
@@ -2017,8 +2160,10 @@
           <w:b w:val="0"/>
           <w:i w:val="0"/>
         </w:rPr>
-        <w:t xml:space="preserve"> (kapu hozzáadása), </w:t>
-      </w:r>
+        <w:t xml:space="preserve"> (kapu hozzáadása),</w:t>
+      </w:r>
+    </w:p>
+    <w:p>
       <w:r>
         <w:rPr>
           <w:rFonts w:ascii="Consolas" w:hAnsi="Consolas"/>
@@ -2032,10 +2177,8 @@
           <w:b w:val="0"/>
           <w:i w:val="0"/>
         </w:rPr>
-        <w:t xml:space="preserve"> (léptetés),</w:t>
-      </w:r>
-    </w:p>
-    <w:p>
+        <w:t xml:space="preserve"> (léptetés), </w:t>
+      </w:r>
       <w:r>
         <w:rPr>
           <w:rFonts w:ascii="Consolas" w:hAnsi="Consolas"/>

</xml_diff>